<commit_message>
Technical report: generalize template title and date into placeholders
The technical-report template had the incident-specific title
([Analysis Report] The Enterprise Project List...) and release date
(2025-08-13) baked into the cover table, so every new report inherited
them. Replace with {{TITLE}} and {{RELEASE_DATE}} placeholders so each
report sets its own title and date.

- technical-report-template.docx: title cell -> {{TITLE}}, date cell -> {{RELEASE_DATE}}
- huawei_technical.py: document TITLE and RELEASE_DATE in docstring
- SKILL.md: add cover-page placeholder table + skeleton entries
- examples/technical/{en,pt}/generate.py: provide TITLE and RELEASE_DATE; regenerate samples
</commit_message>
<xml_diff>
--- a/examples/technical/en/sample-report.docx
+++ b/examples/technical/en/sample-report.docx
@@ -428,70 +428,7 @@
                 <w:sz w:val="48"/>
                 <w:szCs w:val="48"/>
               </w:rPr>
-              <w:fldChar w:fldCharType="begin"/>
-            </w:r>
-            <w:r>
-              <w:rPr>
-                <w:sz w:val="48"/>
-                <w:szCs w:val="48"/>
-              </w:rPr>
-              <w:instrText xml:space="preserve"> </w:instrText>
-            </w:r>
-            <w:r>
-              <w:rPr>
-                <w:rFonts w:hint="eastAsia"/>
-                <w:b/>
-                <w:sz w:val="48"/>
-                <w:szCs w:val="48"/>
-              </w:rPr>
-              <w:instrText>DOCPROPERTY  DocumentName</w:instrText>
-            </w:r>
-            <w:r>
-              <w:rPr>
-                <w:sz w:val="48"/>
-                <w:szCs w:val="48"/>
-              </w:rPr>
-              <w:instrText xml:space="preserve"> </w:instrText>
-            </w:r>
-            <w:r>
-              <w:rPr>
-                <w:sz w:val="48"/>
-                <w:szCs w:val="48"/>
-              </w:rPr>
-              <w:fldChar w:fldCharType="separate"/>
-            </w:r>
-            <w:r>
-              <w:rPr>
-                <w:rFonts w:hint="eastAsia"/>
-                <w:b/>
-                <w:sz w:val="48"/>
-                <w:szCs w:val="48"/>
-              </w:rPr>
-              <w:t xml:space="preserve">[Analysis Report] The Enterprise Project List Is Not Displayed on the </w:t>
-            </w:r>
-            <w:r>
-              <w:rPr>
-                <w:b/>
-                <w:sz w:val="48"/>
-                <w:szCs w:val="48"/>
-              </w:rPr>
-              <w:t>ECS</w:t>
-            </w:r>
-            <w:r>
-              <w:rPr>
-                <w:rFonts w:hint="eastAsia"/>
-                <w:b/>
-                <w:sz w:val="48"/>
-                <w:szCs w:val="48"/>
-              </w:rPr>
-              <w:t xml:space="preserve"> Creation Page in 8.5.1 at the Brazil Site</w:t>
-            </w:r>
-            <w:r>
-              <w:rPr>
-                <w:sz w:val="48"/>
-                <w:szCs w:val="48"/>
-              </w:rPr>
-              <w:fldChar w:fldCharType="end"/>
+              <w:t>[Analysis Report] The Enterprise Project List Is Not Displayed on the ECS Creation Page in 8.5.1 at the Brazil Site</w:t>
             </w:r>
           </w:p>
         </w:tc>
@@ -682,31 +619,7 @@
               </w:rPr>
             </w:pPr>
             <w:r>
-              <w:fldChar w:fldCharType="begin"/>
-            </w:r>
-            <w:r>
-              <w:instrText xml:space="preserve"> </w:instrText>
-            </w:r>
-            <w:r>
-              <w:rPr>
-                <w:b/>
-              </w:rPr>
-              <w:instrText>DOCPROPERTY  ReleaseDate</w:instrText>
-            </w:r>
-            <w:r>
-              <w:instrText xml:space="preserve"> </w:instrText>
-            </w:r>
-            <w:r>
-              <w:fldChar w:fldCharType="separate"/>
-            </w:r>
-            <w:r>
-              <w:rPr>
-                <w:b/>
-              </w:rPr>
-              <w:t>2025 - 08 - 13</w:t>
-            </w:r>
-            <w:r>
-              <w:fldChar w:fldCharType="end"/>
+              <w:t>2025-08-13</w:t>
             </w:r>
           </w:p>
         </w:tc>

</xml_diff>

<commit_message>
Technical report template: remove baked-in ECS screenshots from body
The generalized technical-report-template.docx still carried 4 ECS
creation-page screenshots (image4-7.png) in the Problem Description,
Root Cause Analysis, and Workaround sections from the original incident
report. Every new report inherited these irrelevant images.

Remove the 4 image paragraphs, their relationships (rId26/31/44/45),
and the media files from the template. Keep the 3 Huawei brand logos
(image1-3) on the cover/copyright/trademark pages.

Template: 590 KB -> 184 KB. Regenerate en/pt samples to confirm.
</commit_message>
<xml_diff>
--- a/examples/technical/en/sample-report.docx
+++ b/examples/technical/en/sample-report.docx
@@ -2207,66 +2207,6 @@
         <w:rPr>
           <w:rFonts w:hint="default"/>
         </w:rPr>
-      </w:pPr>
-      <w:r>
-        <w:rPr>
-          <w:noProof/>
-        </w:rPr>
-        <w:drawing>
-          <wp:inline distT="0" distB="0" distL="0" distR="0" wp14:anchorId="2E9C00A9" wp14:editId="79C36EB4">
-            <wp:extent cx="5008880" cy="2136140"/>
-            <wp:effectExtent l="0" t="0" r="0" b="0"/>
-            <wp:docPr id="4" name="Picture 4"/>
-            <wp:cNvGraphicFramePr>
-              <a:graphicFrameLocks xmlns:a="http://schemas.openxmlformats.org/drawingml/2006/main" noChangeAspect="1"/>
-            </wp:cNvGraphicFramePr>
-            <a:graphic xmlns:a="http://schemas.openxmlformats.org/drawingml/2006/main">
-              <a:graphicData uri="http://schemas.openxmlformats.org/drawingml/2006/picture">
-                <pic:pic xmlns:pic="http://schemas.openxmlformats.org/drawingml/2006/picture">
-                  <pic:nvPicPr>
-                    <pic:cNvPr id="0" name="Picture 4"/>
-                    <pic:cNvPicPr>
-                      <a:picLocks noChangeAspect="1" noChangeArrowheads="1"/>
-                    </pic:cNvPicPr>
-                  </pic:nvPicPr>
-                  <pic:blipFill>
-                    <a:blip r:embed="rId26">
-                      <a:extLst>
-                        <a:ext uri="{28A0092B-C50C-407E-A947-70E740481C1C}">
-                          <a14:useLocalDpi xmlns:a14="http://schemas.microsoft.com/office/drawing/2010/main" val="0"/>
-                        </a:ext>
-                      </a:extLst>
-                    </a:blip>
-                    <a:srcRect/>
-                    <a:stretch>
-                      <a:fillRect/>
-                    </a:stretch>
-                  </pic:blipFill>
-                  <pic:spPr bwMode="auto">
-                    <a:xfrm>
-                      <a:off x="0" y="0"/>
-                      <a:ext cx="5008880" cy="2136140"/>
-                    </a:xfrm>
-                    <a:prstGeom prst="rect">
-                      <a:avLst/>
-                    </a:prstGeom>
-                    <a:noFill/>
-                    <a:ln>
-                      <a:noFill/>
-                    </a:ln>
-                  </pic:spPr>
-                </pic:pic>
-              </a:graphicData>
-            </a:graphic>
-          </wp:inline>
-        </w:drawing>
-      </w:r>
-    </w:p>
-    <w:p>
-      <w:pPr>
-        <w:rPr>
-          <w:rFonts w:hint="default"/>
-        </w:rPr>
         <w:sectPr>
           <w:headerReference w:type="even" r:id="rId27"/>
           <w:headerReference w:type="default" r:id="rId28"/>
@@ -2341,67 +2281,6 @@
       </w:pPr>
       <w:r>
         <w:t xml:space="preserve">3. Confirmed the Server Administrator role lacks fine-grained action permissions</w:t>
-      </w:r>
-    </w:p>
-    <w:p>
-      <w:pPr>
-        <w:pStyle w:val="ItemListText"/>
-        <w:rPr>
-          <w:rFonts w:hint="default"/>
-        </w:rPr>
-      </w:pPr>
-      <w:r>
-        <w:rPr>
-          <w:noProof/>
-        </w:rPr>
-        <w:drawing>
-          <wp:inline distT="0" distB="0" distL="0" distR="0" wp14:anchorId="31D210C3" wp14:editId="28D0A3BB">
-            <wp:extent cx="4735830" cy="2040255"/>
-            <wp:effectExtent l="0" t="0" r="0" b="0"/>
-            <wp:docPr id="5" name="Picture 5"/>
-            <wp:cNvGraphicFramePr>
-              <a:graphicFrameLocks xmlns:a="http://schemas.openxmlformats.org/drawingml/2006/main" noChangeAspect="1"/>
-            </wp:cNvGraphicFramePr>
-            <a:graphic xmlns:a="http://schemas.openxmlformats.org/drawingml/2006/main">
-              <a:graphicData uri="http://schemas.openxmlformats.org/drawingml/2006/picture">
-                <pic:pic xmlns:pic="http://schemas.openxmlformats.org/drawingml/2006/picture">
-                  <pic:nvPicPr>
-                    <pic:cNvPr id="0" name="Picture 5"/>
-                    <pic:cNvPicPr>
-                      <a:picLocks noChangeAspect="1" noChangeArrowheads="1"/>
-                    </pic:cNvPicPr>
-                  </pic:nvPicPr>
-                  <pic:blipFill>
-                    <a:blip r:embed="rId31" cstate="print">
-                      <a:extLst>
-                        <a:ext uri="{28A0092B-C50C-407E-A947-70E740481C1C}">
-                          <a14:useLocalDpi xmlns:a14="http://schemas.microsoft.com/office/drawing/2010/main" val="0"/>
-                        </a:ext>
-                      </a:extLst>
-                    </a:blip>
-                    <a:srcRect/>
-                    <a:stretch>
-                      <a:fillRect/>
-                    </a:stretch>
-                  </pic:blipFill>
-                  <pic:spPr bwMode="auto">
-                    <a:xfrm>
-                      <a:off x="0" y="0"/>
-                      <a:ext cx="4735830" cy="2040255"/>
-                    </a:xfrm>
-                    <a:prstGeom prst="rect">
-                      <a:avLst/>
-                    </a:prstGeom>
-                    <a:noFill/>
-                    <a:ln>
-                      <a:noFill/>
-                    </a:ln>
-                  </pic:spPr>
-                </pic:pic>
-              </a:graphicData>
-            </a:graphic>
-          </wp:inline>
-        </w:drawing>
       </w:r>
     </w:p>
     <w:p>
@@ -2968,132 +2847,11 @@
     </w:p>
     <w:p>
       <w:pPr>
-        <w:rPr>
-          <w:rFonts w:hint="default"/>
-        </w:rPr>
-      </w:pPr>
-      <w:r>
-        <w:rPr>
-          <w:noProof/>
-        </w:rPr>
-        <w:lastRenderedPageBreak/>
-        <w:drawing>
-          <wp:inline distT="0" distB="0" distL="0" distR="0" wp14:anchorId="62D9D99C" wp14:editId="546CB636">
-            <wp:extent cx="5076825" cy="2163445"/>
-            <wp:effectExtent l="0" t="0" r="0" b="0"/>
-            <wp:docPr id="6" name="Picture 6"/>
-            <wp:cNvGraphicFramePr>
-              <a:graphicFrameLocks xmlns:a="http://schemas.openxmlformats.org/drawingml/2006/main" noChangeAspect="1"/>
-            </wp:cNvGraphicFramePr>
-            <a:graphic xmlns:a="http://schemas.openxmlformats.org/drawingml/2006/main">
-              <a:graphicData uri="http://schemas.openxmlformats.org/drawingml/2006/picture">
-                <pic:pic xmlns:pic="http://schemas.openxmlformats.org/drawingml/2006/picture">
-                  <pic:nvPicPr>
-                    <pic:cNvPr id="0" name="Picture 6"/>
-                    <pic:cNvPicPr>
-                      <a:picLocks noChangeAspect="1" noChangeArrowheads="1"/>
-                    </pic:cNvPicPr>
-                  </pic:nvPicPr>
-                  <pic:blipFill>
-                    <a:blip r:embed="rId44" cstate="print">
-                      <a:extLst>
-                        <a:ext uri="{28A0092B-C50C-407E-A947-70E740481C1C}">
-                          <a14:useLocalDpi xmlns:a14="http://schemas.microsoft.com/office/drawing/2010/main" val="0"/>
-                        </a:ext>
-                      </a:extLst>
-                    </a:blip>
-                    <a:srcRect/>
-                    <a:stretch>
-                      <a:fillRect/>
-                    </a:stretch>
-                  </pic:blipFill>
-                  <pic:spPr bwMode="auto">
-                    <a:xfrm>
-                      <a:off x="0" y="0"/>
-                      <a:ext cx="5076825" cy="2163445"/>
-                    </a:xfrm>
-                    <a:prstGeom prst="rect">
-                      <a:avLst/>
-                    </a:prstGeom>
-                    <a:noFill/>
-                    <a:ln>
-                      <a:noFill/>
-                    </a:ln>
-                  </pic:spPr>
-                </pic:pic>
-              </a:graphicData>
-            </a:graphic>
-          </wp:inline>
-        </w:drawing>
-      </w:r>
-    </w:p>
-    <w:p>
-      <w:pPr>
         <w:pStyle w:val="Step"/>
         <w:rPr>
           <w:rFonts w:hint="default"/>
         </w:rPr>
       </w:pPr>
-    </w:p>
-    <w:p>
-      <w:pPr>
-        <w:rPr>
-          <w:rFonts w:hint="default"/>
-        </w:rPr>
-      </w:pPr>
-      <w:r>
-        <w:rPr>
-          <w:noProof/>
-        </w:rPr>
-        <w:drawing>
-          <wp:inline distT="0" distB="0" distL="0" distR="0" wp14:anchorId="5A7E2E88" wp14:editId="51169822">
-            <wp:extent cx="5036185" cy="2654300"/>
-            <wp:effectExtent l="0" t="0" r="0" b="0"/>
-            <wp:docPr id="7" name="Picture 7"/>
-            <wp:cNvGraphicFramePr>
-              <a:graphicFrameLocks xmlns:a="http://schemas.openxmlformats.org/drawingml/2006/main" noChangeAspect="1"/>
-            </wp:cNvGraphicFramePr>
-            <a:graphic xmlns:a="http://schemas.openxmlformats.org/drawingml/2006/main">
-              <a:graphicData uri="http://schemas.openxmlformats.org/drawingml/2006/picture">
-                <pic:pic xmlns:pic="http://schemas.openxmlformats.org/drawingml/2006/picture">
-                  <pic:nvPicPr>
-                    <pic:cNvPr id="0" name="Picture 7"/>
-                    <pic:cNvPicPr>
-                      <a:picLocks noChangeAspect="1" noChangeArrowheads="1"/>
-                    </pic:cNvPicPr>
-                  </pic:nvPicPr>
-                  <pic:blipFill>
-                    <a:blip r:embed="rId45">
-                      <a:extLst>
-                        <a:ext uri="{28A0092B-C50C-407E-A947-70E740481C1C}">
-                          <a14:useLocalDpi xmlns:a14="http://schemas.microsoft.com/office/drawing/2010/main" val="0"/>
-                        </a:ext>
-                      </a:extLst>
-                    </a:blip>
-                    <a:srcRect/>
-                    <a:stretch>
-                      <a:fillRect/>
-                    </a:stretch>
-                  </pic:blipFill>
-                  <pic:spPr bwMode="auto">
-                    <a:xfrm>
-                      <a:off x="0" y="0"/>
-                      <a:ext cx="5036185" cy="2654300"/>
-                    </a:xfrm>
-                    <a:prstGeom prst="rect">
-                      <a:avLst/>
-                    </a:prstGeom>
-                    <a:noFill/>
-                    <a:ln>
-                      <a:noFill/>
-                    </a:ln>
-                  </pic:spPr>
-                </pic:pic>
-              </a:graphicData>
-            </a:graphic>
-          </wp:inline>
-        </w:drawing>
-      </w:r>
     </w:p>
     <w:p>
       <w:pPr>

</xml_diff>